<commit_message>
docs: nota de cambio a DeepSeek en Status y Stack Tech v1.2
Status: adenda 5-ago-2026 sobre el cambio de Coder a DeepSeek-V4-Flash.
Stack Tech v1.2: nota al inicio (Coder = deepseek-v4-flash; cifras de
coste del pipeline quedan como cota superior). Cuerpo historico intacto.

Co-Authored-By: Claude Opus 4.8 <noreply@anthropic.com>
</commit_message>
<xml_diff>
--- a/docs/Stack_Tech_V1.2.docx
+++ b/docs/Stack_Tech_V1.2.docx
@@ -2,6 +2,26 @@
 <file path=word/document.xml><?xml version="1.0" encoding="utf-8"?>
 <w:document xmlns:wpc="http://schemas.microsoft.com/office/word/2010/wordprocessingCanvas" xmlns:cx="http://schemas.microsoft.com/office/drawing/2014/chartex" xmlns:cx1="http://schemas.microsoft.com/office/drawing/2015/9/8/chartex" xmlns:cx2="http://schemas.microsoft.com/office/drawing/2015/10/21/chartex" xmlns:cx3="http://schemas.microsoft.com/office/drawing/2016/5/9/chartex" xmlns:cx4="http://schemas.microsoft.com/office/drawing/2016/5/10/chartex" xmlns:cx5="http://schemas.microsoft.com/office/drawing/2016/5/11/chartex" xmlns:cx6="http://schemas.microsoft.com/office/drawing/2016/5/12/chartex" xmlns:cx7="http://schemas.microsoft.com/office/drawing/2016/5/13/chartex" xmlns:cx8="http://schemas.microsoft.com/office/drawing/2016/5/14/chartex" xmlns:mc="http://schemas.openxmlformats.org/markup-compatibility/2006" xmlns:aink="http://schemas.microsoft.com/office/drawing/2016/ink" xmlns:am3d="http://schemas.microsoft.com/office/drawing/2017/model3d" xmlns:o="urn:schemas-microsoft-com:office:office" xmlns:oel="http://schemas.microsoft.com/office/2019/extlst" xmlns:r="http://schemas.openxmlformats.org/officeDocument/2006/relationships" xmlns:m="http://schemas.openxmlformats.org/officeDocument/2006/math" xmlns:v="urn:schemas-microsoft-com:vml" xmlns:wp14="http://schemas.microsoft.com/office/word/2010/wordprocessingDrawing" xmlns:wp="http://schemas.openxmlformats.org/drawingml/2006/wordprocessingDrawing" xmlns:w10="urn:schemas-microsoft-com:office:word" xmlns:w="http://schemas.openxmlformats.org/wordprocessingml/2006/main" xmlns:w14="http://schemas.microsoft.com/office/word/2010/wordml" xmlns:w15="http://schemas.microsoft.com/office/word/2012/wordml" xmlns:w16cex="http://schemas.microsoft.com/office/word/2018/wordml/cex" xmlns:w16cid="http://schemas.microsoft.com/office/word/2016/wordml/cid" xmlns:w16="http://schemas.microsoft.com/office/word/2018/wordml" xmlns:w16du="http://schemas.microsoft.com/office/word/2023/wordml/word16du" xmlns:w16sdtdh="http://schemas.microsoft.com/office/word/2020/wordml/sdtdatahash" xmlns:w16sdtfl="http://schemas.microsoft.com/office/word/2024/wordml/sdtformatlock" xmlns:w16se="http://schemas.microsoft.com/office/word/2015/wordml/symex" xmlns:wpg="http://schemas.microsoft.com/office/word/2010/wordprocessingGroup" xmlns:wpi="http://schemas.microsoft.com/office/word/2010/wordprocessingInk" xmlns:wne="http://schemas.microsoft.com/office/word/2006/wordml" xmlns:wps="http://schemas.microsoft.com/office/word/2010/wordprocessingShape" mc:Ignorable="w14 w15 w16se w16cid w16 w16cex w16sdtdh w16sdtfl w16du wp14">
   <w:body>
+    <w:p>
+      <w:r>
+        <w:rPr>
+          <w:b/>
+          <w:sz w:val="26"/>
+          <w:szCs w:val="26"/>
+        </w:rPr>
+        <w:t xml:space="preserve">ACTUALIZACIÓN 5-ago-2026 — Coder del arnés: DeepSeek-V4-Flash (no GLM-5.2/DeepInfra)</w:t>
+      </w:r>
+    </w:p>
+    <w:p>
+      <w:r>
+        <w:t xml:space="preserve">El nodo Coder/Test-runner (Capa 6) pasó a DeepSeek oficial «deepseek-v4-flash» (vía DEEPSEEK_API_KEY), no GLM-5.2 vía DeepInfra. Cambio por coste, validado en el spike SP-1 (5-ago-2026): puerta 3/5 (compila, render reconocible, React idiomático), coste ≈ 0,0036 USD por pantalla.</w:t>
+      </w:r>
+    </w:p>
+    <w:p>
+      <w:r>
+        <w:t xml:space="preserve">Precio DeepSeek ≈ 0,14 / 0,28 USD por millón de tokens (in/out) frente a 1,20 / 3,00 de GLM/DeepInfra. Por tanto, las estimaciones de coste del pipeline de desarrollo de este documento (Capas 6 y 10) quedan como COTA SUPERIOR conservadora hasta recalcularse con la tarifa real de DeepSeek. VERA en producción sigue en Claude Sonnet 4.6 (QA-A00-06). Trazabilidad: openspec/mvp/findings-register.md (F-001).</w:t>
+      </w:r>
+    </w:p>
     <w:p>
       <w:pPr>
         <w:spacing w:before="2600"/>

</xml_diff>